<commit_message>
docs: Kursanleitung — Schritt 0 (Template nutzen, klonen)
Co-Authored-By: Claude Fable 5 <noreply@anthropic.com>
Claude-Session: https://claude.ai/code/session_01FYKW2PzS11Shw1WrGSoPEX
</commit_message>
<xml_diff>
--- a/KURSANLEITUNG.docx
+++ b/KURSANLEITUNG.docx
@@ -58,7 +58,7 @@
         <w:pStyle w:val="FirstParagraph"/>
       </w:pPr>
       <w:r>
-        <w:t xml:space="preserve">Sie haben ein vorbereitetes Projekt erhalten: die</w:t>
+        <w:t xml:space="preserve">Sie erhalten ein vorbereitetes Projekt: die</w:t>
       </w:r>
       <w:r>
         <w:t xml:space="preserve"> </w:t>
@@ -198,7 +198,7 @@
     </w:p>
     <w:bookmarkEnd w:id="9"/>
     <w:bookmarkEnd w:id="10"/>
-    <w:bookmarkStart w:id="11" w:name="voraussetzungen"/>
+    <w:bookmarkStart w:id="12" w:name="voraussetzungen"/>
     <w:p>
       <w:pPr>
         <w:pStyle w:val="Heading1"/>
@@ -250,7 +250,84 @@
           <w:b/>
           <w:bCs/>
         </w:rPr>
-        <w:t xml:space="preserve">Den Projektordner</w:t>
+        <w:t xml:space="preserve">Ein GitHub-Konto</w:t>
+      </w:r>
+      <w:r>
+        <w:t xml:space="preserve"> </w:t>
+      </w:r>
+      <w:r>
+        <w:t xml:space="preserve">(kostenlos, github.com) und</w:t>
+      </w:r>
+      <w:r>
+        <w:t xml:space="preserve"> </w:t>
+      </w:r>
+      <w:r>
+        <w:rPr>
+          <w:b/>
+          <w:bCs/>
+        </w:rPr>
+        <w:t xml:space="preserve">GitHub Desktop</w:t>
+      </w:r>
+      <w:r>
+        <w:t xml:space="preserve"> </w:t>
+      </w:r>
+      <w:r>
+        <w:t xml:space="preserve">(kostenlos, desktop.github.com) — damit holen Sie sich das Projekt ohne Terminal.</w:t>
+      </w:r>
+    </w:p>
+    <w:p>
+      <w:pPr>
+        <w:pStyle w:val="Compact"/>
+        <w:numPr>
+          <w:ilvl w:val="0"/>
+          <w:numId w:val="1002"/>
+        </w:numPr>
+      </w:pPr>
+      <w:r>
+        <w:rPr>
+          <w:b/>
+          <w:bCs/>
+        </w:rPr>
+        <w:t xml:space="preserve">Ein Terminal</w:t>
+      </w:r>
+      <w:r>
+        <w:t xml:space="preserve">, in dem Sie Claude Code starten. Auf dem Mac ist das die App «Terminal». Unter Windows brauchen Sie</w:t>
+      </w:r>
+      <w:r>
+        <w:t xml:space="preserve"> </w:t>
+      </w:r>
+      <w:r>
+        <w:rPr>
+          <w:b/>
+          <w:bCs/>
+        </w:rPr>
+        <w:t xml:space="preserve">Git Bash</w:t>
+      </w:r>
+      <w:r>
+        <w:t xml:space="preserve"> </w:t>
+      </w:r>
+      <w:r>
+        <w:t xml:space="preserve">(kostenlos, wird mit Git installiert) — die normale Windows-Eingabeaufforderung reicht nicht.</w:t>
+      </w:r>
+    </w:p>
+    <w:p>
+      <w:pPr>
+        <w:pStyle w:val="FirstParagraph"/>
+      </w:pPr>
+      <w:r>
+        <w:t xml:space="preserve">Sie müssen im Terminal nur zwei Dinge können:</w:t>
+      </w:r>
+    </w:p>
+    <w:p>
+      <w:pPr>
+        <w:pStyle w:val="Compact"/>
+        <w:numPr>
+          <w:ilvl w:val="0"/>
+          <w:numId w:val="1003"/>
+        </w:numPr>
+      </w:pPr>
+      <w:r>
+        <w:t xml:space="preserve">In den Projektordner wechseln:</w:t>
       </w:r>
       <w:r>
         <w:t xml:space="preserve"> </w:t>
@@ -259,48 +336,28 @@
         <w:rPr>
           <w:rStyle w:val="VerbatimChar"/>
         </w:rPr>
-        <w:t xml:space="preserve">landingpage-fabrik</w:t>
-      </w:r>
-      <w:r>
-        <w:t xml:space="preserve"> </w:t>
-      </w:r>
-      <w:r>
-        <w:t xml:space="preserve">auf Ihrem Computer (Sie haben ihn als Kopie erhalten).</w:t>
-      </w:r>
-    </w:p>
-    <w:p>
-      <w:pPr>
-        <w:pStyle w:val="Compact"/>
-        <w:numPr>
-          <w:ilvl w:val="0"/>
-          <w:numId w:val="1002"/>
-        </w:numPr>
-      </w:pPr>
-      <w:r>
-        <w:rPr>
-          <w:b/>
-          <w:bCs/>
-        </w:rPr>
-        <w:t xml:space="preserve">Ein Terminal</w:t>
-      </w:r>
-      <w:r>
-        <w:t xml:space="preserve">, in dem Sie Claude Code starten. Auf dem Mac ist das die App «Terminal». Unter Windows brauchen Sie</w:t>
-      </w:r>
-      <w:r>
-        <w:t xml:space="preserve"> </w:t>
-      </w:r>
-      <w:r>
-        <w:rPr>
-          <w:b/>
-          <w:bCs/>
-        </w:rPr>
-        <w:t xml:space="preserve">Git Bash</w:t>
-      </w:r>
-      <w:r>
-        <w:t xml:space="preserve"> </w:t>
-      </w:r>
-      <w:r>
-        <w:t xml:space="preserve">(kostenlos, wird mit Git installiert) — die normale Windows-Eingabeaufforderung reicht nicht.</w:t>
+        <w:t xml:space="preserve">cd Pfad/zum/Ordner/&lt;ihr-projektname&gt;</w:t>
+      </w:r>
+    </w:p>
+    <w:p>
+      <w:pPr>
+        <w:pStyle w:val="Compact"/>
+        <w:numPr>
+          <w:ilvl w:val="0"/>
+          <w:numId w:val="1003"/>
+        </w:numPr>
+      </w:pPr>
+      <w:r>
+        <w:t xml:space="preserve">Claude Code starten:</w:t>
+      </w:r>
+      <w:r>
+        <w:t xml:space="preserve"> </w:t>
+      </w:r>
+      <w:r>
+        <w:rPr>
+          <w:rStyle w:val="VerbatimChar"/>
+        </w:rPr>
+        <w:t xml:space="preserve">claude</w:t>
       </w:r>
     </w:p>
     <w:p>
@@ -308,19 +365,115 @@
         <w:pStyle w:val="FirstParagraph"/>
       </w:pPr>
       <w:r>
-        <w:t xml:space="preserve">Sie müssen im Terminal nur zwei Dinge können:</w:t>
-      </w:r>
-    </w:p>
-    <w:p>
-      <w:pPr>
-        <w:pStyle w:val="Compact"/>
-        <w:numPr>
-          <w:ilvl w:val="0"/>
-          <w:numId w:val="1003"/>
-        </w:numPr>
-      </w:pPr>
-      <w:r>
-        <w:t xml:space="preserve">In den Projektordner wechseln:</w:t>
+        <w:t xml:space="preserve">Alles Weitere geschieht im Gespräch mit Claude.</w:t>
+      </w:r>
+    </w:p>
+    <w:bookmarkStart w:id="11" w:name="X7f248c13ee5e17aed491cbcc41297388c603150"/>
+    <w:p>
+      <w:pPr>
+        <w:pStyle w:val="Heading2"/>
+      </w:pPr>
+      <w:r>
+        <w:t xml:space="preserve">Schritt 0: Das Projekt holen (einmalig, ca. 10 Minuten)</w:t>
+      </w:r>
+    </w:p>
+    <w:p>
+      <w:pPr>
+        <w:pStyle w:val="FirstParagraph"/>
+      </w:pPr>
+      <w:r>
+        <w:t xml:space="preserve">Das Startkit liegt als Vorlage auf GitHub. Sie erstellen daraus Ihr</w:t>
+      </w:r>
+      <w:r>
+        <w:t xml:space="preserve"> </w:t>
+      </w:r>
+      <w:r>
+        <w:rPr>
+          <w:b/>
+          <w:bCs/>
+        </w:rPr>
+        <w:t xml:space="preserve">eigenes</w:t>
+      </w:r>
+      <w:r>
+        <w:t xml:space="preserve"> </w:t>
+      </w:r>
+      <w:r>
+        <w:t xml:space="preserve">Projekt — eine Kopie, die nur Ihnen gehört.</w:t>
+      </w:r>
+    </w:p>
+    <w:p>
+      <w:pPr>
+        <w:pStyle w:val="Compact"/>
+        <w:numPr>
+          <w:ilvl w:val="0"/>
+          <w:numId w:val="1004"/>
+        </w:numPr>
+      </w:pPr>
+      <w:r>
+        <w:t xml:space="preserve">Öffnen Sie im Browser:</w:t>
+      </w:r>
+      <w:r>
+        <w:t xml:space="preserve"> </w:t>
+      </w:r>
+      <w:r>
+        <w:rPr>
+          <w:b/>
+          <w:bCs/>
+        </w:rPr>
+        <w:t xml:space="preserve">https://github.com/hwitzthum/project-template</w:t>
+      </w:r>
+    </w:p>
+    <w:p>
+      <w:pPr>
+        <w:pStyle w:val="Compact"/>
+        <w:numPr>
+          <w:ilvl w:val="0"/>
+          <w:numId w:val="1004"/>
+        </w:numPr>
+      </w:pPr>
+      <w:r>
+        <w:t xml:space="preserve">Klicken Sie oben rechts auf den grünen Button</w:t>
+      </w:r>
+      <w:r>
+        <w:t xml:space="preserve"> </w:t>
+      </w:r>
+      <w:r>
+        <w:rPr>
+          <w:b/>
+          <w:bCs/>
+        </w:rPr>
+        <w:t xml:space="preserve">«Use this template»</w:t>
+      </w:r>
+      <w:r>
+        <w:t xml:space="preserve"> </w:t>
+      </w:r>
+      <w:r>
+        <w:t xml:space="preserve">→</w:t>
+      </w:r>
+      <w:r>
+        <w:t xml:space="preserve"> </w:t>
+      </w:r>
+      <w:r>
+        <w:rPr>
+          <w:b/>
+          <w:bCs/>
+        </w:rPr>
+        <w:t xml:space="preserve">«Create a new repository»</w:t>
+      </w:r>
+      <w:r>
+        <w:t xml:space="preserve">.</w:t>
+      </w:r>
+    </w:p>
+    <w:p>
+      <w:pPr>
+        <w:pStyle w:val="Compact"/>
+        <w:numPr>
+          <w:ilvl w:val="0"/>
+          <w:numId w:val="1004"/>
+        </w:numPr>
+      </w:pPr>
+      <w:r>
+        <w:t xml:space="preserve">Geben Sie einen Namen (z.B.</w:t>
       </w:r>
       <w:r>
         <w:t xml:space="preserve"> </w:t>
@@ -329,19 +482,121 @@
         <w:rPr>
           <w:rStyle w:val="VerbatimChar"/>
         </w:rPr>
-        <w:t xml:space="preserve">cd Pfad/zum/Ordner/landingpage-fabrik</w:t>
-      </w:r>
-    </w:p>
-    <w:p>
-      <w:pPr>
-        <w:pStyle w:val="Compact"/>
-        <w:numPr>
-          <w:ilvl w:val="0"/>
-          <w:numId w:val="1003"/>
-        </w:numPr>
-      </w:pPr>
-      <w:r>
-        <w:t xml:space="preserve">Claude Code starten:</w:t>
+        <w:t xml:space="preserve">landingpages-meinverein</w:t>
+      </w:r>
+      <w:r>
+        <w:t xml:space="preserve">), wählen Sie</w:t>
+      </w:r>
+      <w:r>
+        <w:t xml:space="preserve"> </w:t>
+      </w:r>
+      <w:r>
+        <w:rPr>
+          <w:b/>
+          <w:bCs/>
+        </w:rPr>
+        <w:t xml:space="preserve">Private</w:t>
+      </w:r>
+      <w:r>
+        <w:t xml:space="preserve">, und klicken Sie</w:t>
+      </w:r>
+      <w:r>
+        <w:t xml:space="preserve"> </w:t>
+      </w:r>
+      <w:r>
+        <w:rPr>
+          <w:b/>
+          <w:bCs/>
+        </w:rPr>
+        <w:t xml:space="preserve">«Create repository»</w:t>
+      </w:r>
+      <w:r>
+        <w:t xml:space="preserve">. Sie haben jetzt Ihr eigenes Projekt auf GitHub.</w:t>
+      </w:r>
+    </w:p>
+    <w:p>
+      <w:pPr>
+        <w:pStyle w:val="Compact"/>
+        <w:numPr>
+          <w:ilvl w:val="0"/>
+          <w:numId w:val="1004"/>
+        </w:numPr>
+      </w:pPr>
+      <w:r>
+        <w:t xml:space="preserve">Auf diesem neuen Projekt: grüner Button</w:t>
+      </w:r>
+      <w:r>
+        <w:t xml:space="preserve"> </w:t>
+      </w:r>
+      <w:r>
+        <w:rPr>
+          <w:b/>
+          <w:bCs/>
+        </w:rPr>
+        <w:t xml:space="preserve">«Code»</w:t>
+      </w:r>
+      <w:r>
+        <w:t xml:space="preserve"> </w:t>
+      </w:r>
+      <w:r>
+        <w:t xml:space="preserve">→</w:t>
+      </w:r>
+      <w:r>
+        <w:t xml:space="preserve"> </w:t>
+      </w:r>
+      <w:r>
+        <w:rPr>
+          <w:b/>
+          <w:bCs/>
+        </w:rPr>
+        <w:t xml:space="preserve">«Open with GitHub Desktop»</w:t>
+      </w:r>
+      <w:r>
+        <w:t xml:space="preserve">. GitHub Desktop fragt, wo der Ordner auf Ihrem Computer liegen soll — merken Sie sich diesen Pfad.</w:t>
+      </w:r>
+    </w:p>
+    <w:p>
+      <w:pPr>
+        <w:pStyle w:val="Compact"/>
+        <w:numPr>
+          <w:ilvl w:val="0"/>
+          <w:numId w:val="1004"/>
+        </w:numPr>
+      </w:pPr>
+      <w:r>
+        <w:t xml:space="preserve">In GitHub Desktop:</w:t>
+      </w:r>
+      <w:r>
+        <w:t xml:space="preserve"> </w:t>
+      </w:r>
+      <w:r>
+        <w:rPr>
+          <w:b/>
+          <w:bCs/>
+        </w:rPr>
+        <w:t xml:space="preserve">«Repository» → «Open in Terminal»</w:t>
+      </w:r>
+      <w:r>
+        <w:t xml:space="preserve"> </w:t>
+      </w:r>
+      <w:r>
+        <w:t xml:space="preserve">(Mac) bzw.</w:t>
+      </w:r>
+      <w:r>
+        <w:t xml:space="preserve"> </w:t>
+      </w:r>
+      <w:r>
+        <w:rPr>
+          <w:b/>
+          <w:bCs/>
+        </w:rPr>
+        <w:t xml:space="preserve">«Open in Git Bash»</w:t>
+      </w:r>
+      <w:r>
+        <w:t xml:space="preserve"> </w:t>
+      </w:r>
+      <w:r>
+        <w:t xml:space="preserve">(Windows). Dort tippen Sie</w:t>
       </w:r>
       <w:r>
         <w:t xml:space="preserve"> </w:t>
@@ -352,17 +607,40 @@
         </w:rPr>
         <w:t xml:space="preserve">claude</w:t>
       </w:r>
+      <w:r>
+        <w:t xml:space="preserve"> </w:t>
+      </w:r>
+      <w:r>
+        <w:t xml:space="preserve">— fertig.</w:t>
+      </w:r>
     </w:p>
     <w:p>
       <w:pPr>
         <w:pStyle w:val="FirstParagraph"/>
       </w:pPr>
       <w:r>
-        <w:t xml:space="preserve">Alles Weitere geschieht im Gespräch mit Claude.</w:t>
+        <w:t xml:space="preserve">Wichtig:</w:t>
+      </w:r>
+      <w:r>
+        <w:t xml:space="preserve"> </w:t>
+      </w:r>
+      <w:r>
+        <w:rPr>
+          <w:b/>
+          <w:bCs/>
+        </w:rPr>
+        <w:t xml:space="preserve">Nicht als ZIP herunterladen.</w:t>
+      </w:r>
+      <w:r>
+        <w:t xml:space="preserve"> </w:t>
+      </w:r>
+      <w:r>
+        <w:t xml:space="preserve">Die ZIP-Variante hat keine Projekt-Historie, und ohne sie funktionieren die eingebauten Sicherheitsprüfungen nicht.</w:t>
       </w:r>
     </w:p>
     <w:bookmarkEnd w:id="11"/>
-    <w:bookmarkStart w:id="12" w:name="der-projektordner-was-wo-liegt"/>
+    <w:bookmarkEnd w:id="12"/>
+    <w:bookmarkStart w:id="13" w:name="der-projektordner-was-wo-liegt"/>
     <w:p>
       <w:pPr>
         <w:pStyle w:val="Heading1"/>
@@ -671,8 +949,8 @@
         <w:t xml:space="preserve">) ist Claudes Werkstatt. Sie müssen dort nichts anfassen.</w:t>
       </w:r>
     </w:p>
-    <w:bookmarkEnd w:id="12"/>
-    <w:bookmarkStart w:id="19" w:name="die-schritte"/>
+    <w:bookmarkEnd w:id="13"/>
+    <w:bookmarkStart w:id="20" w:name="die-schritte"/>
     <w:p>
       <w:pPr>
         <w:pStyle w:val="Heading1"/>
@@ -681,7 +959,7 @@
         <w:t xml:space="preserve">Die Schritte</w:t>
       </w:r>
     </w:p>
-    <w:bookmarkStart w:id="13" w:name="Xfeae061e6cb3c0b5867ac73be3856e4e7a2bc21"/>
+    <w:bookmarkStart w:id="14" w:name="Xfeae061e6cb3c0b5867ac73be3856e4e7a2bc21"/>
     <w:p>
       <w:pPr>
         <w:pStyle w:val="Heading2"/>
@@ -736,7 +1014,7 @@
         <w:pStyle w:val="Compact"/>
         <w:numPr>
           <w:ilvl w:val="0"/>
-          <w:numId w:val="1004"/>
+          <w:numId w:val="1005"/>
         </w:numPr>
       </w:pPr>
       <w:r>
@@ -763,7 +1041,7 @@
         <w:pStyle w:val="Compact"/>
         <w:numPr>
           <w:ilvl w:val="0"/>
-          <w:numId w:val="1004"/>
+          <w:numId w:val="1005"/>
         </w:numPr>
       </w:pPr>
       <w:r>
@@ -790,7 +1068,7 @@
         <w:pStyle w:val="Compact"/>
         <w:numPr>
           <w:ilvl w:val="0"/>
-          <w:numId w:val="1004"/>
+          <w:numId w:val="1005"/>
         </w:numPr>
       </w:pPr>
       <w:r>
@@ -802,7 +1080,7 @@
         <w:pStyle w:val="Compact"/>
         <w:numPr>
           <w:ilvl w:val="0"/>
-          <w:numId w:val="1004"/>
+          <w:numId w:val="1005"/>
         </w:numPr>
       </w:pPr>
       <w:r>
@@ -845,8 +1123,8 @@
         <w:t xml:space="preserve">Eine Regel-Datei, die Claude in jeder künftigen Sitzung automatisch beachtet — Sie müssen die Regeln nie wiederholen.</w:t>
       </w:r>
     </w:p>
-    <w:bookmarkEnd w:id="13"/>
-    <w:bookmarkStart w:id="14" w:name="X270258398161a7624d84d7c99f10aef3db1f019"/>
+    <w:bookmarkEnd w:id="14"/>
+    <w:bookmarkStart w:id="15" w:name="X270258398161a7624d84d7c99f10aef3db1f019"/>
     <w:p>
       <w:pPr>
         <w:pStyle w:val="Heading2"/>
@@ -916,7 +1194,7 @@
         <w:pStyle w:val="Compact"/>
         <w:numPr>
           <w:ilvl w:val="0"/>
-          <w:numId w:val="1005"/>
+          <w:numId w:val="1006"/>
         </w:numPr>
       </w:pPr>
       <w:r>
@@ -928,7 +1206,7 @@
         <w:pStyle w:val="Compact"/>
         <w:numPr>
           <w:ilvl w:val="0"/>
-          <w:numId w:val="1005"/>
+          <w:numId w:val="1006"/>
         </w:numPr>
       </w:pPr>
       <w:r>
@@ -948,7 +1226,7 @@
         <w:pStyle w:val="Compact"/>
         <w:numPr>
           <w:ilvl w:val="0"/>
-          <w:numId w:val="1006"/>
+          <w:numId w:val="1007"/>
         </w:numPr>
       </w:pPr>
       <w:r>
@@ -985,8 +1263,8 @@
         <w:t xml:space="preserve">Alles, was Sie dort nicht ausschliessen, baut Claude möglicherweise aus Gefälligkeit mit — und Sie zahlen für Arbeit, die Sie nicht wollten. Nehmen Sie sich für diesen Abschnitt Zeit.</w:t>
       </w:r>
     </w:p>
-    <w:bookmarkEnd w:id="14"/>
-    <w:bookmarkStart w:id="15" w:name="X32c55683a59b9ba8cc0d12b6f181de4484a2ade"/>
+    <w:bookmarkEnd w:id="15"/>
+    <w:bookmarkStart w:id="16" w:name="X32c55683a59b9ba8cc0d12b6f181de4484a2ade"/>
     <w:p>
       <w:pPr>
         <w:pStyle w:val="Heading2"/>
@@ -1036,7 +1314,7 @@
         <w:pStyle w:val="Compact"/>
         <w:numPr>
           <w:ilvl w:val="0"/>
-          <w:numId w:val="1007"/>
+          <w:numId w:val="1008"/>
         </w:numPr>
       </w:pPr>
       <w:r>
@@ -1079,7 +1357,7 @@
         <w:pStyle w:val="Compact"/>
         <w:numPr>
           <w:ilvl w:val="0"/>
-          <w:numId w:val="1007"/>
+          <w:numId w:val="1008"/>
         </w:numPr>
       </w:pPr>
       <w:r>
@@ -1104,7 +1382,7 @@
         <w:pStyle w:val="Compact"/>
         <w:numPr>
           <w:ilvl w:val="0"/>
-          <w:numId w:val="1007"/>
+          <w:numId w:val="1008"/>
         </w:numPr>
       </w:pPr>
       <w:r>
@@ -1146,7 +1424,7 @@
         <w:pStyle w:val="Compact"/>
         <w:numPr>
           <w:ilvl w:val="0"/>
-          <w:numId w:val="1007"/>
+          <w:numId w:val="1008"/>
         </w:numPr>
       </w:pPr>
       <w:r>
@@ -1158,7 +1436,7 @@
         <w:pStyle w:val="Compact"/>
         <w:numPr>
           <w:ilvl w:val="0"/>
-          <w:numId w:val="1007"/>
+          <w:numId w:val="1008"/>
         </w:numPr>
       </w:pPr>
       <w:r>
@@ -1180,7 +1458,7 @@
         <w:pStyle w:val="Compact"/>
         <w:numPr>
           <w:ilvl w:val="0"/>
-          <w:numId w:val="1007"/>
+          <w:numId w:val="1008"/>
         </w:numPr>
       </w:pPr>
       <w:r>
@@ -1192,7 +1470,7 @@
         <w:pStyle w:val="Compact"/>
         <w:numPr>
           <w:ilvl w:val="0"/>
-          <w:numId w:val="1007"/>
+          <w:numId w:val="1008"/>
         </w:numPr>
       </w:pPr>
       <w:r>
@@ -1216,7 +1494,7 @@
         <w:pStyle w:val="Compact"/>
         <w:numPr>
           <w:ilvl w:val="0"/>
-          <w:numId w:val="1008"/>
+          <w:numId w:val="1009"/>
         </w:numPr>
       </w:pPr>
       <w:r>
@@ -1243,7 +1521,7 @@
         <w:pStyle w:val="Compact"/>
         <w:numPr>
           <w:ilvl w:val="0"/>
-          <w:numId w:val="1008"/>
+          <w:numId w:val="1009"/>
         </w:numPr>
       </w:pPr>
       <w:r>
@@ -1267,7 +1545,7 @@
         <w:pStyle w:val="Compact"/>
         <w:numPr>
           <w:ilvl w:val="0"/>
-          <w:numId w:val="1008"/>
+          <w:numId w:val="1009"/>
         </w:numPr>
       </w:pPr>
       <w:r>
@@ -1307,15 +1585,15 @@
         <w:pStyle w:val="Compact"/>
         <w:numPr>
           <w:ilvl w:val="0"/>
-          <w:numId w:val="1008"/>
+          <w:numId w:val="1009"/>
         </w:numPr>
       </w:pPr>
       <w:r>
         <w:t xml:space="preserve">Bitten Sie Claude: «Führe ./scripts/next-tasks.sh aus.» Es sollten mehrere Aufgaben als bereit angezeigt werden. Wird nur eine angezeigt, fragen Sie: «Bestätige für jede Abhängigkeit, dass sie technisch zwingend ist.»</w:t>
       </w:r>
     </w:p>
-    <w:bookmarkEnd w:id="15"/>
-    <w:bookmarkStart w:id="16" w:name="X61b153f06b063b544ce8e2df55c6ffd36b399bd"/>
+    <w:bookmarkEnd w:id="16"/>
+    <w:bookmarkStart w:id="17" w:name="X61b153f06b063b544ce8e2df55c6ffd36b399bd"/>
     <w:p>
       <w:pPr>
         <w:pStyle w:val="Heading2"/>
@@ -1349,7 +1627,7 @@
         <w:pStyle w:val="Compact"/>
         <w:numPr>
           <w:ilvl w:val="0"/>
-          <w:numId w:val="1009"/>
+          <w:numId w:val="1010"/>
         </w:numPr>
       </w:pPr>
       <w:r>
@@ -1361,7 +1639,7 @@
         <w:pStyle w:val="Compact"/>
         <w:numPr>
           <w:ilvl w:val="0"/>
-          <w:numId w:val="1009"/>
+          <w:numId w:val="1010"/>
         </w:numPr>
       </w:pPr>
       <w:r>
@@ -1373,7 +1651,7 @@
         <w:pStyle w:val="Compact"/>
         <w:numPr>
           <w:ilvl w:val="0"/>
-          <w:numId w:val="1009"/>
+          <w:numId w:val="1010"/>
         </w:numPr>
       </w:pPr>
       <w:r>
@@ -1385,7 +1663,7 @@
         <w:pStyle w:val="Compact"/>
         <w:numPr>
           <w:ilvl w:val="0"/>
-          <w:numId w:val="1009"/>
+          <w:numId w:val="1010"/>
         </w:numPr>
       </w:pPr>
       <w:r>
@@ -1465,7 +1743,7 @@
         <w:pStyle w:val="Compact"/>
         <w:numPr>
           <w:ilvl w:val="0"/>
-          <w:numId w:val="1010"/>
+          <w:numId w:val="1011"/>
         </w:numPr>
       </w:pPr>
       <w:r>
@@ -1501,7 +1779,7 @@
         <w:pStyle w:val="Compact"/>
         <w:numPr>
           <w:ilvl w:val="0"/>
-          <w:numId w:val="1010"/>
+          <w:numId w:val="1011"/>
         </w:numPr>
       </w:pPr>
       <w:r>
@@ -1513,7 +1791,7 @@
         <w:pStyle w:val="Compact"/>
         <w:numPr>
           <w:ilvl w:val="0"/>
-          <w:numId w:val="1010"/>
+          <w:numId w:val="1011"/>
         </w:numPr>
       </w:pPr>
       <w:r>
@@ -1543,7 +1821,7 @@
         <w:pStyle w:val="Compact"/>
         <w:numPr>
           <w:ilvl w:val="0"/>
-          <w:numId w:val="1011"/>
+          <w:numId w:val="1012"/>
         </w:numPr>
       </w:pPr>
       <w:r>
@@ -1564,7 +1842,7 @@
         <w:pStyle w:val="Compact"/>
         <w:numPr>
           <w:ilvl w:val="0"/>
-          <w:numId w:val="1011"/>
+          <w:numId w:val="1012"/>
         </w:numPr>
       </w:pPr>
       <w:r>
@@ -1585,7 +1863,7 @@
         <w:pStyle w:val="Compact"/>
         <w:numPr>
           <w:ilvl w:val="0"/>
-          <w:numId w:val="1011"/>
+          <w:numId w:val="1012"/>
         </w:numPr>
       </w:pPr>
       <w:r>
@@ -1631,8 +1909,8 @@
         <w:t xml:space="preserve">), richten Sie sich danach. Wenn nicht, ist das kein Problem — es geht nur um Kosten, nicht um Funktion.</w:t>
       </w:r>
     </w:p>
-    <w:bookmarkEnd w:id="16"/>
-    <w:bookmarkStart w:id="17" w:name="Xb62123c0c69c88fbeaebfcf53922b970bff7963"/>
+    <w:bookmarkEnd w:id="17"/>
+    <w:bookmarkStart w:id="18" w:name="Xb62123c0c69c88fbeaebfcf53922b970bff7963"/>
     <w:p>
       <w:pPr>
         <w:pStyle w:val="Heading2"/>
@@ -1654,7 +1932,7 @@
         <w:pStyle w:val="Compact"/>
         <w:numPr>
           <w:ilvl w:val="0"/>
-          <w:numId w:val="1012"/>
+          <w:numId w:val="1013"/>
         </w:numPr>
       </w:pPr>
       <w:r>
@@ -1676,7 +1954,7 @@
         <w:pStyle w:val="Compact"/>
         <w:numPr>
           <w:ilvl w:val="0"/>
-          <w:numId w:val="1012"/>
+          <w:numId w:val="1013"/>
         </w:numPr>
       </w:pPr>
       <w:r>
@@ -1698,7 +1976,7 @@
         <w:pStyle w:val="Compact"/>
         <w:numPr>
           <w:ilvl w:val="0"/>
-          <w:numId w:val="1012"/>
+          <w:numId w:val="1013"/>
         </w:numPr>
       </w:pPr>
       <w:r>
@@ -1730,8 +2008,8 @@
         <w:t xml:space="preserve">steht pro erledigter Aufgabe, wie viele Runden und Tokens sie gekostet hat. Sie müssen das nicht auswerten — aber wenn eine Aufgabe auffällig teuer war, fragen Sie Claude warum. Meist ist die Antwort: Die Aufgabe war zu gross oder zu vage.</w:t>
       </w:r>
     </w:p>
-    <w:bookmarkEnd w:id="17"/>
-    <w:bookmarkStart w:id="18" w:name="weitere-seiten"/>
+    <w:bookmarkEnd w:id="18"/>
+    <w:bookmarkStart w:id="19" w:name="weitere-seiten"/>
     <w:p>
       <w:pPr>
         <w:pStyle w:val="Heading2"/>
@@ -1748,9 +2026,9 @@
         <w:t xml:space="preserve">Für jede weitere Landingpage: Schritt 2 (neuer Brief), dann eine kurze Initialisierung nur für diese Seite. Sagen Sie Claude: «Es gibt einen neuen Brief in docs/briefs/&lt;slug&gt;.md. Ergänze features.md um eine Gruppe für diese Seite und lege die zugehörigen Aufgaben in docs/tasks/ an — nach demselben Vorgehen wie in docs/templates/initializer-prompt.md, aber nur für diese Seite. Stelle mir vorher die Fragen, deren Antwort die Zerlegung ändern würde.» Dann weiter mit Schritt 4.</w:t>
       </w:r>
     </w:p>
-    <w:bookmarkEnd w:id="18"/>
     <w:bookmarkEnd w:id="19"/>
-    <w:bookmarkStart w:id="24" w:name="was-sie-wissen-sollten"/>
+    <w:bookmarkEnd w:id="20"/>
+    <w:bookmarkStart w:id="25" w:name="was-sie-wissen-sollten"/>
     <w:p>
       <w:pPr>
         <w:pStyle w:val="Heading1"/>
@@ -1759,7 +2037,7 @@
         <w:t xml:space="preserve">Was Sie wissen sollten</w:t>
       </w:r>
     </w:p>
-    <w:bookmarkStart w:id="20" w:name="was-claude-nicht-darf-mit-absicht"/>
+    <w:bookmarkStart w:id="21" w:name="was-claude-nicht-darf-mit-absicht"/>
     <w:p>
       <w:pPr>
         <w:pStyle w:val="Heading2"/>
@@ -1794,7 +2072,7 @@
         <w:pStyle w:val="Compact"/>
         <w:numPr>
           <w:ilvl w:val="0"/>
-          <w:numId w:val="1013"/>
+          <w:numId w:val="1014"/>
         </w:numPr>
       </w:pPr>
       <w:r>
@@ -1839,7 +2117,7 @@
         <w:pStyle w:val="Compact"/>
         <w:numPr>
           <w:ilvl w:val="0"/>
-          <w:numId w:val="1013"/>
+          <w:numId w:val="1014"/>
         </w:numPr>
       </w:pPr>
       <w:r>
@@ -1860,7 +2138,7 @@
         <w:pStyle w:val="Compact"/>
         <w:numPr>
           <w:ilvl w:val="0"/>
-          <w:numId w:val="1013"/>
+          <w:numId w:val="1014"/>
         </w:numPr>
       </w:pPr>
       <w:r>
@@ -1875,8 +2153,8 @@
         <w:t xml:space="preserve">Wenn Claude sagt, es dürfe etwas nicht: Das ist kein Fehler, sondern der Schutz. Veröffentlichen Sie Seiten bewusst und selbst — Claude erklärt Ihnen, wie.</w:t>
       </w:r>
     </w:p>
-    <w:bookmarkEnd w:id="20"/>
-    <w:bookmarkStart w:id="21" w:name="geheimnisse"/>
+    <w:bookmarkEnd w:id="21"/>
+    <w:bookmarkStart w:id="22" w:name="geheimnisse"/>
     <w:p>
       <w:pPr>
         <w:pStyle w:val="Heading2"/>
@@ -1955,8 +2233,8 @@
         <w:t xml:space="preserve">Der Chat ist kein Tresor.</w:t>
       </w:r>
     </w:p>
-    <w:bookmarkEnd w:id="21"/>
-    <w:bookmarkStart w:id="22" w:name="wenn-etwas-schiefgeht"/>
+    <w:bookmarkEnd w:id="22"/>
+    <w:bookmarkStart w:id="23" w:name="wenn-etwas-schiefgeht"/>
     <w:p>
       <w:pPr>
         <w:pStyle w:val="Heading2"/>
@@ -1970,7 +2248,7 @@
         <w:pStyle w:val="Compact"/>
         <w:numPr>
           <w:ilvl w:val="0"/>
-          <w:numId w:val="1014"/>
+          <w:numId w:val="1015"/>
         </w:numPr>
       </w:pPr>
       <w:r>
@@ -1992,7 +2270,7 @@
         <w:pStyle w:val="Compact"/>
         <w:numPr>
           <w:ilvl w:val="0"/>
-          <w:numId w:val="1014"/>
+          <w:numId w:val="1015"/>
         </w:numPr>
       </w:pPr>
       <w:r>
@@ -2014,7 +2292,7 @@
         <w:pStyle w:val="Compact"/>
         <w:numPr>
           <w:ilvl w:val="0"/>
-          <w:numId w:val="1014"/>
+          <w:numId w:val="1015"/>
         </w:numPr>
       </w:pPr>
       <w:r>
@@ -2049,7 +2327,7 @@
         <w:pStyle w:val="Compact"/>
         <w:numPr>
           <w:ilvl w:val="0"/>
-          <w:numId w:val="1014"/>
+          <w:numId w:val="1015"/>
         </w:numPr>
       </w:pPr>
       <w:r>
@@ -2071,7 +2349,7 @@
         <w:pStyle w:val="Compact"/>
         <w:numPr>
           <w:ilvl w:val="0"/>
-          <w:numId w:val="1014"/>
+          <w:numId w:val="1015"/>
         </w:numPr>
       </w:pPr>
       <w:r>
@@ -2088,8 +2366,8 @@
         <w:t xml:space="preserve">Alles ist in Git gespeichert. Sagen Sie: «Zeige mir die letzten Commits und erkläre, was sich seit dem letzten funktionierenden Stand geändert hat.»</w:t>
       </w:r>
     </w:p>
-    <w:bookmarkEnd w:id="22"/>
-    <w:bookmarkStart w:id="23" w:name="drei-regeln-die-alles-zusammenhalten"/>
+    <w:bookmarkEnd w:id="23"/>
+    <w:bookmarkStart w:id="24" w:name="drei-regeln-die-alles-zusammenhalten"/>
     <w:p>
       <w:pPr>
         <w:pStyle w:val="Heading2"/>
@@ -2103,7 +2381,7 @@
         <w:pStyle w:val="Compact"/>
         <w:numPr>
           <w:ilvl w:val="0"/>
-          <w:numId w:val="1015"/>
+          <w:numId w:val="1016"/>
         </w:numPr>
       </w:pPr>
       <w:r>
@@ -2125,7 +2403,7 @@
         <w:pStyle w:val="Compact"/>
         <w:numPr>
           <w:ilvl w:val="0"/>
-          <w:numId w:val="1015"/>
+          <w:numId w:val="1016"/>
         </w:numPr>
       </w:pPr>
       <w:r>
@@ -2147,7 +2425,7 @@
         <w:pStyle w:val="Compact"/>
         <w:numPr>
           <w:ilvl w:val="0"/>
-          <w:numId w:val="1015"/>
+          <w:numId w:val="1016"/>
         </w:numPr>
       </w:pPr>
       <w:r>
@@ -2164,9 +2442,9 @@
         <w:t xml:space="preserve">Sie müssen keinen Code lesen. Sie müssen die Seite anschauen.</w:t>
       </w:r>
     </w:p>
-    <w:bookmarkEnd w:id="23"/>
     <w:bookmarkEnd w:id="24"/>
-    <w:bookmarkStart w:id="25" w:name="kleines-glossar"/>
+    <w:bookmarkEnd w:id="25"/>
+    <w:bookmarkStart w:id="26" w:name="kleines-glossar"/>
     <w:p>
       <w:pPr>
         <w:pStyle w:val="Heading1"/>
@@ -2478,7 +2756,7 @@
         </w:tc>
       </w:tr>
     </w:tbl>
-    <w:bookmarkEnd w:id="25"/>
+    <w:bookmarkEnd w:id="26"/>
     <w:sectPr>
       <w:footnotePr>
         <w:numRestart w:val="eachSect"/>
@@ -2962,6 +3240,36 @@
     </w:lvlOverride>
   </w:num>
   <w:num w:numId="1006">
+    <w:abstractNumId w:val="99411"/>
+    <w:lvlOverride w:ilvl="0">
+      <w:startOverride w:val="1"/>
+    </w:lvlOverride>
+    <w:lvlOverride w:ilvl="1">
+      <w:startOverride w:val="1"/>
+    </w:lvlOverride>
+    <w:lvlOverride w:ilvl="2">
+      <w:startOverride w:val="1"/>
+    </w:lvlOverride>
+    <w:lvlOverride w:ilvl="3">
+      <w:startOverride w:val="1"/>
+    </w:lvlOverride>
+    <w:lvlOverride w:ilvl="4">
+      <w:startOverride w:val="1"/>
+    </w:lvlOverride>
+    <w:lvlOverride w:ilvl="5">
+      <w:startOverride w:val="1"/>
+    </w:lvlOverride>
+    <w:lvlOverride w:ilvl="6">
+      <w:startOverride w:val="1"/>
+    </w:lvlOverride>
+    <w:lvlOverride w:ilvl="7">
+      <w:startOverride w:val="1"/>
+    </w:lvlOverride>
+    <w:lvlOverride w:ilvl="8">
+      <w:startOverride w:val="1"/>
+    </w:lvlOverride>
+  </w:num>
+  <w:num w:numId="1007">
     <w:abstractNumId w:val="99413"/>
     <w:lvlOverride w:ilvl="0">
       <w:startOverride w:val="3"/>
@@ -2991,7 +3299,7 @@
       <w:startOverride w:val="3"/>
     </w:lvlOverride>
   </w:num>
-  <w:num w:numId="1007">
+  <w:num w:numId="1008">
     <w:abstractNumId w:val="99411"/>
     <w:lvlOverride w:ilvl="0">
       <w:startOverride w:val="1"/>
@@ -3021,38 +3329,8 @@
       <w:startOverride w:val="1"/>
     </w:lvlOverride>
   </w:num>
-  <w:num w:numId="1008">
+  <w:num w:numId="1009">
     <w:abstractNumId w:val="991"/>
-  </w:num>
-  <w:num w:numId="1009">
-    <w:abstractNumId w:val="99411"/>
-    <w:lvlOverride w:ilvl="0">
-      <w:startOverride w:val="1"/>
-    </w:lvlOverride>
-    <w:lvlOverride w:ilvl="1">
-      <w:startOverride w:val="1"/>
-    </w:lvlOverride>
-    <w:lvlOverride w:ilvl="2">
-      <w:startOverride w:val="1"/>
-    </w:lvlOverride>
-    <w:lvlOverride w:ilvl="3">
-      <w:startOverride w:val="1"/>
-    </w:lvlOverride>
-    <w:lvlOverride w:ilvl="4">
-      <w:startOverride w:val="1"/>
-    </w:lvlOverride>
-    <w:lvlOverride w:ilvl="5">
-      <w:startOverride w:val="1"/>
-    </w:lvlOverride>
-    <w:lvlOverride w:ilvl="6">
-      <w:startOverride w:val="1"/>
-    </w:lvlOverride>
-    <w:lvlOverride w:ilvl="7">
-      <w:startOverride w:val="1"/>
-    </w:lvlOverride>
-    <w:lvlOverride w:ilvl="8">
-      <w:startOverride w:val="1"/>
-    </w:lvlOverride>
   </w:num>
   <w:num w:numId="1010">
     <w:abstractNumId w:val="99411"/>
@@ -3085,9 +3363,39 @@
     </w:lvlOverride>
   </w:num>
   <w:num w:numId="1011">
+    <w:abstractNumId w:val="99411"/>
+    <w:lvlOverride w:ilvl="0">
+      <w:startOverride w:val="1"/>
+    </w:lvlOverride>
+    <w:lvlOverride w:ilvl="1">
+      <w:startOverride w:val="1"/>
+    </w:lvlOverride>
+    <w:lvlOverride w:ilvl="2">
+      <w:startOverride w:val="1"/>
+    </w:lvlOverride>
+    <w:lvlOverride w:ilvl="3">
+      <w:startOverride w:val="1"/>
+    </w:lvlOverride>
+    <w:lvlOverride w:ilvl="4">
+      <w:startOverride w:val="1"/>
+    </w:lvlOverride>
+    <w:lvlOverride w:ilvl="5">
+      <w:startOverride w:val="1"/>
+    </w:lvlOverride>
+    <w:lvlOverride w:ilvl="6">
+      <w:startOverride w:val="1"/>
+    </w:lvlOverride>
+    <w:lvlOverride w:ilvl="7">
+      <w:startOverride w:val="1"/>
+    </w:lvlOverride>
+    <w:lvlOverride w:ilvl="8">
+      <w:startOverride w:val="1"/>
+    </w:lvlOverride>
+  </w:num>
+  <w:num w:numId="1012">
     <w:abstractNumId w:val="991"/>
   </w:num>
-  <w:num w:numId="1012">
+  <w:num w:numId="1013">
     <w:abstractNumId w:val="99411"/>
     <w:lvlOverride w:ilvl="0">
       <w:startOverride w:val="1"/>
@@ -3116,14 +3424,14 @@
     <w:lvlOverride w:ilvl="8">
       <w:startOverride w:val="1"/>
     </w:lvlOverride>
-  </w:num>
-  <w:num w:numId="1013">
-    <w:abstractNumId w:val="991"/>
   </w:num>
   <w:num w:numId="1014">
     <w:abstractNumId w:val="991"/>
   </w:num>
   <w:num w:numId="1015">
+    <w:abstractNumId w:val="991"/>
+  </w:num>
+  <w:num w:numId="1016">
     <w:abstractNumId w:val="99411"/>
     <w:lvlOverride w:ilvl="0">
       <w:startOverride w:val="1"/>

</xml_diff>